<commit_message>
Đổi tên trường mới trong đề cương học liệu số
Đề cương HLS là văn bản cuối cùng còn tên cũ "Trường Đại học Sư phạm Kỹ
thuật Vĩnh Long" (tiêu đề phụ đầu trang và hai đoạn nội dung). Đổi sang
"Trường Đại học Công nghệ Kỹ thuật Vĩnh Long" ở nguồn (docs/de_cuong_hls.json,
tools/dung_de_cuong.py) rồi dựng lại .docx/.pdf.

Số hiệu "QĐ 55/QĐ-ĐHSPKTVL-ĐT_ĐBCL" giữ nguyên vì là số văn bản đã ban hành.
Đã soát toàn bộ .docx (thân, đầu/chân trang, bảng) và .pdf trong repo: không
còn tên trường hay tên khoa cũ.

Co-Authored-By: Claude Opus 5.5 <noreply@anthropic.com>
Claude-Session: https://claude.ai/code/session_0152M9LpadR2sZFTpCBKYoDy
</commit_message>
<xml_diff>
--- a/de-cuong/DE_CUONG_HOC_PHAN_HLS.docx
+++ b/de-cuong/DE_CUONG_HOC_PHAN_HLS.docx
@@ -29,7 +29,7 @@
           <w:i/>
           <w:sz w:val="26"/>
         </w:rPr>
-        <w:t>Khởi sự doanh nghiệp (EC1606) — Trường Đại học Sư phạm Kỹ thuật Vĩnh Long</w:t>
+        <w:t>Khởi sự doanh nghiệp (EC1606) — Trường Đại học Công nghệ Kỹ thuật Vĩnh Long</w:t>
       </w:r>
     </w:p>
     <w:p>
@@ -57,7 +57,7 @@
           <w:i w:val="0"/>
           <w:sz w:val="26"/>
         </w:rPr>
-        <w:t>Học phần Khởi sự doanh nghiệp (tên tiếng Anh: Start-Up), mã học phần EC1606, có khối lượng 02 tín chỉ, được tổ chức giảng dạy hoàn toàn bằng hình thức lý thuyết (100% lý thuyết, không bố trí giờ thực hành hay đồ án môn học) tại Trường Đại học Sư phạm Kỹ thuật Vĩnh Long (VLUTE). Học phần do giảng viên Đỗ Thùy Hương và Nguyễn Hùng Cường phụ trách chính, cùng tham gia giảng dạy có các giảng viên Nguyễn Thị Hồng Nga và Nguyễn Duy Tân. Học phần không yêu cầu học phần tiên quyết, học phần học trước hay học phần song hành, nên có thể được bố trí giảng dạy linh hoạt ngay từ những học kỳ đầu của chương trình đào tạo, phù hợp với mục tiêu trang bị sớm cho sinh viên những kiến thức và kỹ năng nền tảng về khởi nghiệp kinh doanh, trước khi các em tiếp cận các học phần chuyên ngành sâu hơn ở các học kỳ tiếp theo.</w:t>
+        <w:t>Học phần Khởi sự doanh nghiệp (tên tiếng Anh: Start-Up), mã học phần EC1606, có khối lượng 02 tín chỉ, được tổ chức giảng dạy hoàn toàn bằng hình thức lý thuyết (100% lý thuyết, không bố trí giờ thực hành hay đồ án môn học) tại Trường Đại học Công nghệ Kỹ thuật Vĩnh Long (VLUTE). Học phần do giảng viên Đỗ Thùy Hương và Nguyễn Hùng Cường phụ trách chính, cùng tham gia giảng dạy có các giảng viên Nguyễn Thị Hồng Nga và Nguyễn Duy Tân. Học phần không yêu cầu học phần tiên quyết, học phần học trước hay học phần song hành, nên có thể được bố trí giảng dạy linh hoạt ngay từ những học kỳ đầu của chương trình đào tạo, phù hợp với mục tiêu trang bị sớm cho sinh viên những kiến thức và kỹ năng nền tảng về khởi nghiệp kinh doanh, trước khi các em tiếp cận các học phần chuyên ngành sâu hơn ở các học kỳ tiếp theo.</w:t>
       </w:r>
     </w:p>
     <w:p>
@@ -2067,7 +2067,7 @@
           <w:i w:val="0"/>
           <w:sz w:val="26"/>
         </w:rPr>
-        <w:t>Đề cương học liệu số của học phần Khởi sự doanh nghiệp (EC1606) được biên soạn bởi giảng viên Đỗ Thùy Hương, trên cơ sở đề cương học phần chính thức đã được phê duyệt theo Quyết định số 55/QĐ-ĐHSPKTVL-ĐT_ĐBCL của Trường Đại học Sư phạm Kỹ thuật Vĩnh Long, nhằm đáp ứng yêu cầu về cấu trúc và nội dung học liệu số quy định tại Phụ lục 1 của Quyết định này.</w:t>
+        <w:t>Đề cương học liệu số của học phần Khởi sự doanh nghiệp (EC1606) được biên soạn bởi giảng viên Đỗ Thùy Hương, trên cơ sở đề cương học phần chính thức đã được phê duyệt theo Quyết định số 55/QĐ-ĐHSPKTVL-ĐT_ĐBCL của Trường Đại học Công nghệ Kỹ thuật Vĩnh Long, nhằm đáp ứng yêu cầu về cấu trúc và nội dung học liệu số quy định tại Phụ lục 1 của Quyết định này.</w:t>
       </w:r>
     </w:p>
     <w:p>

</xml_diff>